<commit_message>
Add HANDOFF.md; fix cover letter placeholder and data sentence
Co-Authored-By: Claude Opus 5.5 <noreply@anthropic.com>
Claude-Session: https://claude.ai/code/session_011m1nWiFCs4xdp8CXy2DSzu
</commit_message>
<xml_diff>
--- a/DFT_paper_revision/SUBMISSION_PACKAGE/01_Cover_Letter.docx
+++ b/DFT_paper_revision/SUBMISSION_PACKAGE/01_Cover_Letter.docx
@@ -198,7 +198,7 @@
         <w:t xml:space="preserve"> </w:t>
       </w:r>
       <w:r>
-        <w:t xml:space="preserve">that connect bulk defect chemistry to surface and interface function; the manuscript builds directly on several such papers published in the journal, including DFT+U work on Er-doped anatase and on Pr at the anatase (101) surface. All input files, output files, pseudopotential datasets, analysis tables and figure scripts are deposited in a public repository (DOI given in the Data Availability statement) so that every reported number can be traced.</w:t>
+        <w:t xml:space="preserve">that connect bulk defect chemistry to surface and interface function; the manuscript builds directly on several such papers published in the journal, including DFT+U work on Er-doped anatase and on Pr at the anatase (101) surface. The input and output files, pseudopotential datasets, analysis tables and figure scripts are available from the corresponding author on request and will be deposited in a public repository (Zenodo) with a citable DOI on acceptance.</w:t>
       </w:r>
     </w:p>
     <w:p>
@@ -214,33 +214,7 @@
         <w:pStyle w:val="BodyText"/>
       </w:pPr>
       <w:r>
-        <w:rPr>
-          <w:bCs/>
-          <w:b/>
-        </w:rPr>
-        <w:t xml:space="preserve">[AUTHOR ACTION: add 3–5 suggested reviewers with affiliation and e-mail, none from Universiti Malaya or recent co-authors, e.g. researchers active on DFT+U defect chemistry of TiO</w:t>
-      </w:r>
-      <w:r>
-        <w:rPr>
-          <w:vertAlign w:val="subscript"/>
-          <w:bCs/>
-          <w:b/>
-        </w:rPr>
-        <w:t xml:space="preserve">2</w:t>
-      </w:r>
-      <w:r>
-        <w:rPr>
-          <w:bCs/>
-          <w:b/>
-        </w:rPr>
-        <w:t xml:space="preserve"> </w:t>
-      </w:r>
-      <w:r>
-        <w:rPr>
-          <w:bCs/>
-          <w:b/>
-        </w:rPr>
-        <w:t xml:space="preserve">and on alkali/rare-earth doping of oxides; and list any opposed reviewers.]</w:t>
+        <w:t xml:space="preserve">Suggested reviewers are listed in the submission system.</w:t>
       </w:r>
     </w:p>
     <w:p>

</xml_diff>